<commit_message>
finished week 08 personal site assignment
</commit_message>
<xml_diff>
--- a/peronsal-website/word-documents/W08-Brainstorming.docx
+++ b/peronsal-website/word-documents/W08-Brainstorming.docx
@@ -4,18 +4,129 @@
   <w:body>
     <w:p>
       <w:r>
-        <w:t>Header will have the logo and 2 links. The logo will also be a link back to the home page. The two links are: Schedule a Demo, and Services.</w:t>
-      </w:r>
-    </w:p>
-    <w:p>
-      <w:r>
-        <w:t xml:space="preserve">Home page is a sales pitch that has a catch phrase: Small steps towards a better life. Beneath that there will be a paragraph: “Making changes to your life doesn’t have to start with big things. It’s taking small incremental steps that will lead to big results.” </w:t>
-      </w:r>
+        <w:t xml:space="preserve">Header will have the logo and 2 links. </w:t>
+      </w:r>
+    </w:p>
+    <w:p>
+      <w:pPr>
+        <w:pStyle w:val="Heading1"/>
+      </w:pPr>
+      <w:r>
+        <w:t>Header Logo and Links</w:t>
+      </w:r>
+    </w:p>
+    <w:p>
+      <w:r>
+        <w:t xml:space="preserve">The logo will also be a link back to the home page. </w:t>
+      </w:r>
+    </w:p>
+    <w:p>
+      <w:pPr>
+        <w:pStyle w:val="Heading1"/>
+      </w:pPr>
+      <w:r>
+        <w:t>Header Links</w:t>
+      </w:r>
+    </w:p>
+    <w:p>
+      <w:r>
+        <w:t>The two links are: Schedule a Demo, and Services.</w:t>
+      </w:r>
+      <w:r>
+        <w:t xml:space="preserve"> Schedule a demo will take the user to the Demo page where they can schedule a time to attend a webinar. The Services link will take the user to the course page that lists </w:t>
+      </w:r>
+      <w:proofErr w:type="gramStart"/>
+      <w:r>
+        <w:t>all of</w:t>
+      </w:r>
+      <w:proofErr w:type="gramEnd"/>
+      <w:r>
+        <w:t xml:space="preserve"> the courses the user can take.</w:t>
+      </w:r>
+    </w:p>
+    <w:p>
+      <w:pPr>
+        <w:pStyle w:val="Heading1"/>
+      </w:pPr>
+      <w:r>
+        <w:t>Body Catch Phrase</w:t>
+      </w:r>
+    </w:p>
+    <w:p>
+      <w:r>
+        <w:t xml:space="preserve">Home page is a sales pitch that has a catch phrase: </w:t>
+      </w:r>
+      <w:proofErr w:type="gramStart"/>
+      <w:r>
+        <w:t>Small</w:t>
+      </w:r>
+      <w:proofErr w:type="gramEnd"/>
+      <w:r>
+        <w:t xml:space="preserve"> steps towards a better life. Beneath th</w:t>
+      </w:r>
+      <w:r>
+        <w:t>e catch phrase</w:t>
+      </w:r>
+      <w:r>
+        <w:t xml:space="preserve"> there will be a paragraph: “Making changes to your life doesn’t have to start with big things. It’s taking small incremental steps that will lead to big results.” </w:t>
+      </w:r>
+    </w:p>
+    <w:p>
+      <w:pPr>
+        <w:pStyle w:val="Heading1"/>
+      </w:pPr>
+      <w:r>
+        <w:t>Body Links</w:t>
+      </w:r>
+    </w:p>
+    <w:p>
       <w:r>
         <w:t>Below that will be links to two child pages. One for scheduling a demo, one for seeing available training. The link could say “Learn more about our trainings” and “click here to schedule a demo”.</w:t>
       </w:r>
     </w:p>
     <w:p>
+      <w:pPr>
+        <w:pStyle w:val="Heading1"/>
+      </w:pPr>
+      <w:r>
+        <w:t>Demo Page Header</w:t>
+      </w:r>
+    </w:p>
+    <w:p>
+      <w:r>
+        <w:t>The logo is there and will contain a link that takes user back to the home page.</w:t>
+      </w:r>
+    </w:p>
+    <w:p>
+      <w:pPr>
+        <w:pStyle w:val="Heading1"/>
+      </w:pPr>
+      <w:r>
+        <w:t>Demo Page Header Links</w:t>
+      </w:r>
+    </w:p>
+    <w:p>
+      <w:r>
+        <w:t xml:space="preserve">The two links are: Schedule a Demo, and Services. Schedule a demo will take the user to the Demo page where they can schedule a time to attend a webinar. The Services link will take the user to the course page that lists </w:t>
+      </w:r>
+      <w:proofErr w:type="gramStart"/>
+      <w:r>
+        <w:t>all of</w:t>
+      </w:r>
+      <w:proofErr w:type="gramEnd"/>
+      <w:r>
+        <w:t xml:space="preserve"> the courses the user can take.</w:t>
+      </w:r>
+    </w:p>
+    <w:p>
+      <w:pPr>
+        <w:pStyle w:val="Heading1"/>
+      </w:pPr>
+      <w:r>
+        <w:t>Demo Page Body</w:t>
+      </w:r>
+    </w:p>
+    <w:p>
       <w:r>
         <w:t xml:space="preserve">The Demo page is a page that has the user schedule a time to view a live webinar. There is a description. The description will say: “Sign up for a live webinar to learn more about our content and services. We’ll walk you through our course content, showing you how simple </w:t>
       </w:r>
@@ -30,11 +141,64 @@
       </w:r>
     </w:p>
     <w:p>
-      <w:r>
-        <w:t>The trainings and content page will consist of a list of different courses the users can take. One class will be on finances. Header will say: “Finances”. Description will say: “Lean the basics of budgeting, increasing your credit score, and investing.</w:t>
-      </w:r>
-      <w:r>
-        <w:t xml:space="preserve"> Another class will be time management. Header will say: “Time Management”. Description will say: “Learn all the basic skills you need to be more efficient in your everyday life</w:t>
+      <w:pPr>
+        <w:pStyle w:val="Heading1"/>
+      </w:pPr>
+      <w:r>
+        <w:t>Training Page Header</w:t>
+      </w:r>
+    </w:p>
+    <w:p>
+      <w:r>
+        <w:t>The logo is there and will contain a link that takes user back to the home page.</w:t>
+      </w:r>
+    </w:p>
+    <w:p>
+      <w:pPr>
+        <w:pStyle w:val="Heading1"/>
+      </w:pPr>
+      <w:r>
+        <w:t>Training Page Header Links</w:t>
+      </w:r>
+    </w:p>
+    <w:p>
+      <w:r>
+        <w:t xml:space="preserve">The two links are: Schedule a Demo, and Services. Schedule a demo will take the user to the Demo page where they can schedule a time to attend a webinar. The Services link will take the user to the course page that lists </w:t>
+      </w:r>
+      <w:proofErr w:type="gramStart"/>
+      <w:r>
+        <w:t>all of</w:t>
+      </w:r>
+      <w:proofErr w:type="gramEnd"/>
+      <w:r>
+        <w:t xml:space="preserve"> the courses the user can take.</w:t>
+      </w:r>
+    </w:p>
+    <w:p>
+      <w:pPr>
+        <w:pStyle w:val="Heading1"/>
+      </w:pPr>
+      <w:r>
+        <w:lastRenderedPageBreak/>
+        <w:t>Training Page Body</w:t>
+      </w:r>
+    </w:p>
+    <w:p>
+      <w:r>
+        <w:t xml:space="preserve">The trainings and content page will consist of a list of different courses the users can take. One class will be on finances. </w:t>
+      </w:r>
+    </w:p>
+    <w:p>
+      <w:r>
+        <w:t>Header will say: “Finances”. Description will say: “Lean the basics of budgeting, increasing your credit score, and investing.</w:t>
+      </w:r>
+      <w:r>
+        <w:t xml:space="preserve"> Another class will be time management. </w:t>
+      </w:r>
+    </w:p>
+    <w:p>
+      <w:r>
+        <w:t>Header will say: “Time Management”. Description will say: “Learn all the basic skills you need to be more efficient in your everyday life</w:t>
       </w:r>
       <w:r>
         <w:t>. You’ll learn how to prioritize your time, as well as showing you available tools like calendars and task managers.</w:t>
@@ -48,6 +212,8 @@
       <w:r>
         <w:t xml:space="preserve"> </w:t>
       </w:r>
+    </w:p>
+    <w:p>
       <w:r>
         <w:t>Another course will be “Goal Setting”. Description: “</w:t>
       </w:r>
@@ -55,7 +221,85 @@
         <w:t>This course is intended to help you gain a better understanding of the why behind the goal through a hierarchy.</w:t>
       </w:r>
       <w:r>
-        <w:t xml:space="preserve"> Other topics: “Habit Forming”, “Learn how to learn”, “Mindfulness and meditation”, “Leadership”, “Communication”.</w:t>
+        <w:t xml:space="preserve"> Other topics: </w:t>
+      </w:r>
+    </w:p>
+    <w:p>
+      <w:r>
+        <w:t xml:space="preserve">Next course: </w:t>
+      </w:r>
+      <w:r>
+        <w:t>“Habit Forming”</w:t>
+      </w:r>
+      <w:r>
+        <w:t>. Description: “Everything you need to know about starting a habit and being consistent. We’ll also go over how to overcome the days where you really don’t want to push through and continue.”</w:t>
+      </w:r>
+    </w:p>
+    <w:p>
+      <w:r>
+        <w:t xml:space="preserve">Another course: </w:t>
+      </w:r>
+      <w:r>
+        <w:t>“Learn</w:t>
+      </w:r>
+      <w:r>
+        <w:t>ing</w:t>
+      </w:r>
+      <w:r>
+        <w:t xml:space="preserve"> how to learn”</w:t>
+      </w:r>
+      <w:r>
+        <w:t xml:space="preserve">. Description: “Learning can be a difficult process for people. This course will help you discover all the different types of learning methods out there </w:t>
+      </w:r>
+      <w:r>
+        <w:t>as well as help you find what works best for you.”</w:t>
+      </w:r>
+    </w:p>
+    <w:p>
+      <w:r>
+        <w:t xml:space="preserve">Next course: </w:t>
+      </w:r>
+      <w:r>
+        <w:t>“Mindfulness and meditation”</w:t>
+      </w:r>
+      <w:r>
+        <w:t>. Description: “There are a myriad of benefits when taking this course. From relieving stress, improving sleep, to helping you alleviate many troubling physical issues. This course has it all.”</w:t>
+      </w:r>
+    </w:p>
+    <w:p>
+      <w:r>
+        <w:t xml:space="preserve">Next course: </w:t>
+      </w:r>
+      <w:r>
+        <w:t>“Leadership”</w:t>
+      </w:r>
+      <w:r>
+        <w:t xml:space="preserve">. Description: </w:t>
+      </w:r>
+      <w:r>
+        <w:t xml:space="preserve">“Learn how to lead like a pro. This course will go over the different styles of leading, conflict resolution, engaging your team, providing constructive criticism, </w:t>
+      </w:r>
+      <w:proofErr w:type="gramStart"/>
+      <w:r>
+        <w:t>coaching</w:t>
+      </w:r>
+      <w:proofErr w:type="gramEnd"/>
+      <w:r>
+        <w:t xml:space="preserve"> and mentoring, and many others.”</w:t>
+      </w:r>
+    </w:p>
+    <w:p>
+      <w:r>
+        <w:t xml:space="preserve">Course: </w:t>
+      </w:r>
+      <w:r>
+        <w:t>“Communication”.</w:t>
+      </w:r>
+      <w:r>
+        <w:t xml:space="preserve"> Description: “This course covers all the different ways of communication with others, from verbal, non-verbal, and written. We’ll go over writing a professional letter and email</w:t>
+      </w:r>
+      <w:r>
+        <w:t xml:space="preserve"> to writing a resume. </w:t>
       </w:r>
     </w:p>
     <w:p>
@@ -63,7 +307,32 @@
         <w:t xml:space="preserve">Footer </w:t>
       </w:r>
       <w:r>
-        <w:t>will have social media links as well as the website name and an all rights reserved text.</w:t>
+        <w:t>will have social media links</w:t>
+      </w:r>
+      <w:r>
+        <w:t xml:space="preserve"> </w:t>
+      </w:r>
+      <w:r>
+        <w:t>as well as the website name and an all rights reserved text.</w:t>
+      </w:r>
+      <w:r>
+        <w:t xml:space="preserve"> The social media links will be for </w:t>
+      </w:r>
+      <w:proofErr w:type="spellStart"/>
+      <w:r>
+        <w:t>facebook</w:t>
+      </w:r>
+      <w:proofErr w:type="spellEnd"/>
+      <w:r>
+        <w:t xml:space="preserve">, twitter, and </w:t>
+      </w:r>
+      <w:proofErr w:type="spellStart"/>
+      <w:r>
+        <w:t>youtube</w:t>
+      </w:r>
+      <w:proofErr w:type="spellEnd"/>
+      <w:r>
+        <w:t>.</w:t>
       </w:r>
     </w:p>
     <w:sectPr>

</xml_diff>

<commit_message>
finished w09 water rafting site
</commit_message>
<xml_diff>
--- a/peronsal-website/word-documents/W08-Brainstorming.docx
+++ b/peronsal-website/word-documents/W08-Brainstorming.docx
@@ -123,7 +123,7 @@
         <w:pStyle w:val="Heading1"/>
       </w:pPr>
       <w:r>
-        <w:t>Demo Page Body</w:t>
+        <w:t>Schedule a time for Demo</w:t>
       </w:r>
     </w:p>
     <w:p>
@@ -145,161 +145,133 @@
         <w:pStyle w:val="Heading1"/>
       </w:pPr>
       <w:r>
-        <w:t>Training Page Header</w:t>
-      </w:r>
-    </w:p>
-    <w:p>
-      <w:r>
-        <w:t>The logo is there and will contain a link that takes user back to the home page.</w:t>
-      </w:r>
-    </w:p>
-    <w:p>
-      <w:pPr>
-        <w:pStyle w:val="Heading1"/>
-      </w:pPr>
-      <w:r>
-        <w:t>Training Page Header Links</w:t>
-      </w:r>
-    </w:p>
-    <w:p>
-      <w:r>
-        <w:t xml:space="preserve">The two links are: Schedule a Demo, and Services. Schedule a demo will take the user to the Demo page where they can schedule a time to attend a webinar. The Services link will take the user to the course page that lists </w:t>
+        <w:t>List of Available Services</w:t>
+      </w:r>
+    </w:p>
+    <w:p>
+      <w:r>
+        <w:t xml:space="preserve">The trainings and content page will consist of a list of different courses the users can take. One class will be on finances. </w:t>
+      </w:r>
+    </w:p>
+    <w:p>
+      <w:r>
+        <w:t>Header will say: “Finances”. Description will say: “Lean the basics of budgeting, increasing your credit score, and investing.</w:t>
+      </w:r>
+      <w:r>
+        <w:t xml:space="preserve"> Another class will be time management. </w:t>
+      </w:r>
+    </w:p>
+    <w:p>
+      <w:r>
+        <w:lastRenderedPageBreak/>
+        <w:t>Header will say: “Time Management”. Description will say: “Learn all the basic skills you need to be more efficient in your everyday life</w:t>
+      </w:r>
+      <w:r>
+        <w:t>. You’ll learn how to prioritize your time, as well as showing you available tools like calendars and task managers.</w:t>
+      </w:r>
+      <w:r>
+        <w:t>”</w:t>
+      </w:r>
+      <w:r>
+        <w:t xml:space="preserve"> </w:t>
+      </w:r>
+      <w:r>
+        <w:t xml:space="preserve"> </w:t>
+      </w:r>
+    </w:p>
+    <w:p>
+      <w:r>
+        <w:t>Another course will be “Goal Setting”. Description: “</w:t>
+      </w:r>
+      <w:r>
+        <w:t>This course is intended to help you gain a better understanding of the why behind the goal through a hierarchy.</w:t>
+      </w:r>
+      <w:r>
+        <w:t xml:space="preserve"> Other topics: </w:t>
+      </w:r>
+    </w:p>
+    <w:p>
+      <w:r>
+        <w:t xml:space="preserve">Next course: </w:t>
+      </w:r>
+      <w:r>
+        <w:t>“Habit Forming”</w:t>
+      </w:r>
+      <w:r>
+        <w:t>. Description: “Everything you need to know about starting a habit and being consistent. We’ll also go over how to overcome the days where you really don’t want to push through and continue.”</w:t>
+      </w:r>
+    </w:p>
+    <w:p>
+      <w:r>
+        <w:t xml:space="preserve">Another course: </w:t>
+      </w:r>
+      <w:r>
+        <w:t>“Learn</w:t>
+      </w:r>
+      <w:r>
+        <w:t>ing</w:t>
+      </w:r>
+      <w:r>
+        <w:t xml:space="preserve"> how to learn”</w:t>
+      </w:r>
+      <w:r>
+        <w:t xml:space="preserve">. Description: “Learning can be a difficult process for people. This course will help you discover all the different types of learning methods out there </w:t>
+      </w:r>
+      <w:r>
+        <w:t>as well as help you find what works best for you.”</w:t>
+      </w:r>
+    </w:p>
+    <w:p>
+      <w:r>
+        <w:t xml:space="preserve">Next course: </w:t>
+      </w:r>
+      <w:r>
+        <w:t>“Mindfulness and meditation”</w:t>
+      </w:r>
+      <w:r>
+        <w:t>. Description: “There are a myriad of benefits when taking this course. From relieving stress, improving sleep, to helping you alleviate many troubling physical issues. This course has it all.”</w:t>
+      </w:r>
+    </w:p>
+    <w:p>
+      <w:r>
+        <w:t xml:space="preserve">Next course: </w:t>
+      </w:r>
+      <w:r>
+        <w:t>“Leadership”</w:t>
+      </w:r>
+      <w:r>
+        <w:t xml:space="preserve">. Description: </w:t>
+      </w:r>
+      <w:r>
+        <w:t xml:space="preserve">“Learn how to lead like a pro. This course will go over the different styles of leading, conflict resolution, engaging your team, providing constructive criticism, </w:t>
       </w:r>
       <w:proofErr w:type="gramStart"/>
       <w:r>
-        <w:t>all of</w:t>
+        <w:t>coaching</w:t>
       </w:r>
       <w:proofErr w:type="gramEnd"/>
       <w:r>
-        <w:t xml:space="preserve"> the courses the user can take.</w:t>
-      </w:r>
-    </w:p>
-    <w:p>
-      <w:pPr>
-        <w:pStyle w:val="Heading1"/>
-      </w:pPr>
-      <w:r>
-        <w:lastRenderedPageBreak/>
-        <w:t>Training Page Body</w:t>
-      </w:r>
-    </w:p>
-    <w:p>
-      <w:r>
-        <w:t xml:space="preserve">The trainings and content page will consist of a list of different courses the users can take. One class will be on finances. </w:t>
-      </w:r>
-    </w:p>
-    <w:p>
-      <w:r>
-        <w:t>Header will say: “Finances”. Description will say: “Lean the basics of budgeting, increasing your credit score, and investing.</w:t>
-      </w:r>
-      <w:r>
-        <w:t xml:space="preserve"> Another class will be time management. </w:t>
-      </w:r>
-    </w:p>
-    <w:p>
-      <w:r>
-        <w:t>Header will say: “Time Management”. Description will say: “Learn all the basic skills you need to be more efficient in your everyday life</w:t>
-      </w:r>
-      <w:r>
-        <w:t>. You’ll learn how to prioritize your time, as well as showing you available tools like calendars and task managers.</w:t>
+        <w:t xml:space="preserve"> and mentoring, and many others.”</w:t>
+      </w:r>
+    </w:p>
+    <w:p>
+      <w:r>
+        <w:t xml:space="preserve">Course: </w:t>
+      </w:r>
+      <w:r>
+        <w:t>“Communication”.</w:t>
+      </w:r>
+      <w:r>
+        <w:t xml:space="preserve"> Description: “This course covers all the different ways of communication with others, from verbal, non-verbal, and written. We’ll go over writing a professional letter and email</w:t>
+      </w:r>
+      <w:r>
+        <w:t xml:space="preserve"> to writing a resume.</w:t>
       </w:r>
       <w:r>
         <w:t>”</w:t>
       </w:r>
       <w:r>
         <w:t xml:space="preserve"> </w:t>
-      </w:r>
-      <w:r>
-        <w:t xml:space="preserve"> </w:t>
-      </w:r>
-    </w:p>
-    <w:p>
-      <w:r>
-        <w:t>Another course will be “Goal Setting”. Description: “</w:t>
-      </w:r>
-      <w:r>
-        <w:t>This course is intended to help you gain a better understanding of the why behind the goal through a hierarchy.</w:t>
-      </w:r>
-      <w:r>
-        <w:t xml:space="preserve"> Other topics: </w:t>
-      </w:r>
-    </w:p>
-    <w:p>
-      <w:r>
-        <w:t xml:space="preserve">Next course: </w:t>
-      </w:r>
-      <w:r>
-        <w:t>“Habit Forming”</w:t>
-      </w:r>
-      <w:r>
-        <w:t>. Description: “Everything you need to know about starting a habit and being consistent. We’ll also go over how to overcome the days where you really don’t want to push through and continue.”</w:t>
-      </w:r>
-    </w:p>
-    <w:p>
-      <w:r>
-        <w:t xml:space="preserve">Another course: </w:t>
-      </w:r>
-      <w:r>
-        <w:t>“Learn</w:t>
-      </w:r>
-      <w:r>
-        <w:t>ing</w:t>
-      </w:r>
-      <w:r>
-        <w:t xml:space="preserve"> how to learn”</w:t>
-      </w:r>
-      <w:r>
-        <w:t xml:space="preserve">. Description: “Learning can be a difficult process for people. This course will help you discover all the different types of learning methods out there </w:t>
-      </w:r>
-      <w:r>
-        <w:t>as well as help you find what works best for you.”</w:t>
-      </w:r>
-    </w:p>
-    <w:p>
-      <w:r>
-        <w:t xml:space="preserve">Next course: </w:t>
-      </w:r>
-      <w:r>
-        <w:t>“Mindfulness and meditation”</w:t>
-      </w:r>
-      <w:r>
-        <w:t>. Description: “There are a myriad of benefits when taking this course. From relieving stress, improving sleep, to helping you alleviate many troubling physical issues. This course has it all.”</w:t>
-      </w:r>
-    </w:p>
-    <w:p>
-      <w:r>
-        <w:t xml:space="preserve">Next course: </w:t>
-      </w:r>
-      <w:r>
-        <w:t>“Leadership”</w:t>
-      </w:r>
-      <w:r>
-        <w:t xml:space="preserve">. Description: </w:t>
-      </w:r>
-      <w:r>
-        <w:t xml:space="preserve">“Learn how to lead like a pro. This course will go over the different styles of leading, conflict resolution, engaging your team, providing constructive criticism, </w:t>
-      </w:r>
-      <w:proofErr w:type="gramStart"/>
-      <w:r>
-        <w:t>coaching</w:t>
-      </w:r>
-      <w:proofErr w:type="gramEnd"/>
-      <w:r>
-        <w:t xml:space="preserve"> and mentoring, and many others.”</w:t>
-      </w:r>
-    </w:p>
-    <w:p>
-      <w:r>
-        <w:t xml:space="preserve">Course: </w:t>
-      </w:r>
-      <w:r>
-        <w:t>“Communication”.</w:t>
-      </w:r>
-      <w:r>
-        <w:t xml:space="preserve"> Description: “This course covers all the different ways of communication with others, from verbal, non-verbal, and written. We’ll go over writing a professional letter and email</w:t>
-      </w:r>
-      <w:r>
-        <w:t xml:space="preserve"> to writing a resume. </w:t>
       </w:r>
     </w:p>
     <w:p>

</xml_diff>